<commit_message>
docs(manual+guide): 同步 reports 新位置 + UIA 惰性暴露设计说明
reports 位置变更 (跟 PDF 同目录, 不在 exe 同级) 在两份文档里都要反映:
- 用户手册: 步骤8/第6节/Q&A里4处文字 + 步骤7加'首选项窗口一闪而过是正常'提醒
- 开发指南: 代码结构表/BatchRunner.run签名/REPORT_DIR→REPORT_SUBDIR/坑表新增1行

开发指南新增 4.6 节'为什么找按钮失败时要 Ctrl+K/Esc 开关首选项':
- 阶梯式讲清 hover/set_focus/最小化/Ctrl+K 四种触发器的强度对比
- 指向根目录 TROUBLESHOOTING.md 看完整诊断过程

两份 .docx 已重新生成.
</commit_message>
<xml_diff>
--- a/doc/开发指南.docx
+++ b/doc/开发指南.docx
@@ -1114,7 +1114,7 @@
                 <w:rFonts w:ascii="Consolas" w:hAnsi="Consolas" w:eastAsia="Consolas"/>
                 <w:sz w:val="20"/>
               </w:rPr>
-              <w:t>doc/</w:t>
+              <w:t>TROUBLESHOOTING.md</w:t>
             </w:r>
           </w:p>
         </w:tc>
@@ -1129,7 +1129,7 @@
                 <w:rFonts w:ascii="微软雅黑" w:hAnsi="微软雅黑" w:eastAsia="微软雅黑"/>
                 <w:sz w:val="20"/>
               </w:rPr>
-              <w:t>本目录, Word 文档 (用户/开发者视角)</w:t>
+              <w:t>踩坑记录 (UIA 惰性暴露等), 必读</w:t>
             </w:r>
           </w:p>
         </w:tc>
@@ -1146,7 +1146,7 @@
                 <w:rFonts w:ascii="Consolas" w:hAnsi="Consolas" w:eastAsia="Consolas"/>
                 <w:sz w:val="20"/>
               </w:rPr>
-              <w:t>reports/</w:t>
+              <w:t>doc/</w:t>
             </w:r>
           </w:p>
         </w:tc>
@@ -1161,7 +1161,39 @@
                 <w:rFonts w:ascii="微软雅黑" w:hAnsi="微软雅黑" w:eastAsia="微软雅黑"/>
                 <w:sz w:val="20"/>
               </w:rPr>
-              <w:t>运行时生成的 CSV 报告</w:t>
+              <w:t>本目录, Word 文档 (用户/开发者视角)</w:t>
+            </w:r>
+          </w:p>
+        </w:tc>
+      </w:tr>
+      <w:tr>
+        <w:tc>
+          <w:tcPr>
+            <w:tcW w:type="dxa" w:w="2835"/>
+          </w:tcPr>
+          <w:p>
+            <w:r/>
+            <w:r>
+              <w:rPr>
+                <w:rFonts w:ascii="Consolas" w:hAnsi="Consolas" w:eastAsia="Consolas"/>
+                <w:sz w:val="20"/>
+              </w:rPr>
+              <w:t>&lt;输入文件夹&gt;/reports/</w:t>
+            </w:r>
+          </w:p>
+        </w:tc>
+        <w:tc>
+          <w:tcPr>
+            <w:tcW w:type="dxa" w:w="6236"/>
+          </w:tcPr>
+          <w:p>
+            <w:r/>
+            <w:r>
+              <w:rPr>
+                <w:rFonts w:ascii="微软雅黑" w:hAnsi="微软雅黑" w:eastAsia="微软雅黑"/>
+                <w:sz w:val="20"/>
+              </w:rPr>
+              <w:t>运行时生成的 CSV 报告 (跟输入 PDF 同目录, 不在程序目录)</w:t>
             </w:r>
           </w:p>
         </w:tc>
@@ -1728,7 +1760,7 @@
         <w:rPr>
           <w:rFonts w:ascii="微软雅黑" w:hAnsi="微软雅黑" w:eastAsia="微软雅黑"/>
         </w:rPr>
-        <w:t>run(pdf_list, watermark) → 主循环，返回报告路径</w:t>
+        <w:t>run(pdf_list, watermark, input_folder=None) → 主循环，返回报告路径。input_folder 决定 reports/ 输出位置（不传则用 pdf_list[0] 的父目录）</w:t>
       </w:r>
     </w:p>
     <w:p>
@@ -2337,6 +2369,130 @@
     </w:p>
     <w:p>
       <w:pPr>
+        <w:pStyle w:val="Heading2"/>
+      </w:pPr>
+      <w:r>
+        <w:rPr>
+          <w:rFonts w:ascii="微软雅黑" w:hAnsi="微软雅黑" w:eastAsia="微软雅黑"/>
+        </w:rPr>
+        <w:t>4.6 为什么找按钮失败时要主动 Ctrl+K / Esc 开关首选项</w:t>
+      </w:r>
+    </w:p>
+    <w:p>
+      <w:r>
+        <w:rPr>
+          <w:rFonts w:ascii="微软雅黑" w:hAnsi="微软雅黑" w:eastAsia="微软雅黑"/>
+          <w:b w:val="0"/>
+          <w:sz w:val="22"/>
+        </w:rPr>
+        <w:t>Acrobat 右侧工具栏（AVL_AVView 容器）的子按钮 UIA 节点是「惰性注入」的——descendants(Button, title='去水印') 在 Acrobat 内部「未触发重画」时返回 0，看起来像按钮不存在，但屏幕上肉眼是看得见的。同一个 PDF 多次跑，时成时败。</w:t>
+      </w:r>
+    </w:p>
+    <w:p>
+      <w:r>
+        <w:rPr>
+          <w:rFonts w:ascii="微软雅黑" w:hAnsi="微软雅黑" w:eastAsia="微软雅黑"/>
+          <w:b w:val="0"/>
+          <w:sz w:val="22"/>
+        </w:rPr>
+        <w:t>实测的触发器强度阶梯（弱→强）：</w:t>
+      </w:r>
+    </w:p>
+    <w:p>
+      <w:pPr>
+        <w:pStyle w:val="ListBullet"/>
+      </w:pPr>
+      <w:r>
+        <w:rPr>
+          <w:rFonts w:ascii="微软雅黑" w:hAnsi="微软雅黑" w:eastAsia="微软雅黑"/>
+        </w:rPr>
+        <w:t>鼠标 hover + 滚轮 ❌ —— Acrobat 不响应 WM_MOUSEMOVE/WHEEL</w:t>
+      </w:r>
+    </w:p>
+    <w:p>
+      <w:pPr>
+        <w:pStyle w:val="ListBullet"/>
+      </w:pPr>
+      <w:r>
+        <w:rPr>
+          <w:rFonts w:ascii="微软雅黑" w:hAnsi="微软雅黑" w:eastAsia="微软雅黑"/>
+        </w:rPr>
+        <w:t>set_focus 切别的窗口再切回 ❌ —— 已经是前台时 set_focus 是 no-op，不触发 WM_ACTIVATE</w:t>
+      </w:r>
+    </w:p>
+    <w:p>
+      <w:pPr>
+        <w:pStyle w:val="ListBullet"/>
+      </w:pPr>
+      <w:r>
+        <w:rPr>
+          <w:rFonts w:ascii="微软雅黑" w:hAnsi="微软雅黑" w:eastAsia="微软雅黑"/>
+        </w:rPr>
+        <w:t>最小化 + 还原 ✓ —— 触发 WM_ACTIVATE，但窗口会闪</w:t>
+      </w:r>
+    </w:p>
+    <w:p>
+      <w:pPr>
+        <w:pStyle w:val="ListBullet"/>
+      </w:pPr>
+      <w:r>
+        <w:rPr>
+          <w:rFonts w:ascii="微软雅黑" w:hAnsi="微软雅黑" w:eastAsia="微软雅黑"/>
+        </w:rPr>
+        <w:t>Ctrl+K 开首选项 → Esc 关 ✓ —— 真实模态对话框开关，100% 触发 Acrobat 重画 + 重新枚举控件</w:t>
+      </w:r>
+    </w:p>
+    <w:p>
+      <w:r>
+        <w:rPr>
+          <w:rFonts w:ascii="微软雅黑" w:hAnsi="微软雅黑" w:eastAsia="微软雅黑"/>
+          <w:b w:val="0"/>
+          <w:sz w:val="22"/>
+        </w:rPr>
+        <w:t>实现：AcrobatWorker._toggle_preferences_dialog()，在 _click_visible_button() 失败循环里每 4 轮（POLL_INTERVAL=0.5s × 4 ≈ 2s）调用一次，超时上限 90s。</w:t>
+      </w:r>
+    </w:p>
+    <w:tbl>
+      <w:tblPr>
+        <w:tblW w:type="auto" w:w="0"/>
+        <w:tblLook w:firstColumn="1" w:firstRow="1" w:lastColumn="0" w:lastRow="0" w:noHBand="0" w:noVBand="1" w:val="04A0"/>
+      </w:tblPr>
+      <w:tblGrid>
+        <w:gridCol w:w="8640"/>
+      </w:tblGrid>
+      <w:tr>
+        <w:tc>
+          <w:tcPr>
+            <w:tcW w:type="dxa" w:w="8640"/>
+            <w:shd w:val="clear" w:color="auto" w:fill="E8F4FF"/>
+          </w:tcPr>
+          <w:p>
+            <w:r/>
+            <w:r>
+              <w:rPr>
+                <w:rFonts w:ascii="微软雅黑" w:hAnsi="微软雅黑" w:eastAsia="微软雅黑"/>
+                <w:b/>
+                <w:color w:val="0066CC"/>
+                <w:sz w:val="22"/>
+              </w:rPr>
+              <w:t>💡 完整诊断过程参见根目录 TROUBLESHOOTING.md</w:t>
+            </w:r>
+          </w:p>
+          <w:p>
+            <w:r>
+              <w:rPr>
+                <w:rFonts w:ascii="微软雅黑" w:hAnsi="微软雅黑" w:eastAsia="微软雅黑"/>
+                <w:sz w:val="22"/>
+              </w:rPr>
+              <w:t>包括 5 个误判方向、4 种修复方案的实测对照表。未来再遇到 'UI 上看得见但 UIA 查不到' 类问题，直接复用那份文档的诊断路径。</w:t>
+            </w:r>
+          </w:p>
+        </w:tc>
+      </w:tr>
+    </w:tbl>
+    <w:p/>
+    <w:p>
+      <w:pPr>
         <w:pStyle w:val="Heading1"/>
       </w:pPr>
       <w:r>
@@ -2353,7 +2509,7 @@
           <w:b w:val="0"/>
           <w:sz w:val="22"/>
         </w:rPr>
-        <w:t>11 条实战中遇到并解决的坑，按时间倒序：</w:t>
+        <w:t>12 条实战中遇到并解决的坑，按时间倒序：</w:t>
       </w:r>
     </w:p>
     <w:tbl>
@@ -2416,6 +2572,53 @@
                 <w:sz w:val="22"/>
               </w:rPr>
               <w:t>解决</w:t>
+            </w:r>
+          </w:p>
+        </w:tc>
+      </w:tr>
+      <w:tr>
+        <w:tc>
+          <w:tcPr>
+            <w:tcW w:type="dxa" w:w="2835"/>
+          </w:tcPr>
+          <w:p>
+            <w:r/>
+            <w:r>
+              <w:rPr>
+                <w:rFonts w:ascii="微软雅黑" w:hAnsi="微软雅黑" w:eastAsia="微软雅黑"/>
+                <w:sz w:val="20"/>
+              </w:rPr>
+              <w:t>找右侧按钮返回 0 候选, 但屏幕能看见</w:t>
+            </w:r>
+          </w:p>
+        </w:tc>
+        <w:tc>
+          <w:tcPr>
+            <w:tcW w:type="dxa" w:w="2835"/>
+          </w:tcPr>
+          <w:p>
+            <w:r/>
+            <w:r>
+              <w:rPr>
+                <w:rFonts w:ascii="微软雅黑" w:hAnsi="微软雅黑" w:eastAsia="微软雅黑"/>
+                <w:sz w:val="20"/>
+              </w:rPr>
+              <w:t>AVL_AVView 容器的子按钮 UIA 注入是惰性的</w:t>
+            </w:r>
+          </w:p>
+        </w:tc>
+        <w:tc>
+          <w:tcPr>
+            <w:tcW w:type="dxa" w:w="3402"/>
+          </w:tcPr>
+          <w:p>
+            <w:r/>
+            <w:r>
+              <w:rPr>
+                <w:rFonts w:ascii="微软雅黑" w:hAnsi="微软雅黑" w:eastAsia="微软雅黑"/>
+                <w:sz w:val="20"/>
+              </w:rPr>
+              <w:t>失败循环里 Ctrl+K + Esc 开关首选项触发 Acrobat 重画 (4.6 节)</w:t>
             </w:r>
           </w:p>
         </w:tc>
@@ -5607,7 +5810,7 @@
                 <w:rFonts w:ascii="Consolas" w:hAnsi="Consolas" w:eastAsia="Consolas"/>
                 <w:sz w:val="20"/>
               </w:rPr>
-              <w:t>REPORT_DIR</w:t>
+              <w:t>REPORT_SUBDIR</w:t>
             </w:r>
           </w:p>
         </w:tc>
@@ -5637,7 +5840,7 @@
                 <w:rFonts w:ascii="微软雅黑" w:hAnsi="微软雅黑" w:eastAsia="微软雅黑"/>
                 <w:sz w:val="20"/>
               </w:rPr>
-              <w:t>CSV 报告输出目录</w:t>
+              <w:t>CSV 报告子目录名 (实际路径 = &lt;输入文件夹&gt;/REPORT_SUBDIR)</w:t>
             </w:r>
           </w:p>
         </w:tc>

</xml_diff>